<commit_message>
Replace Resume.docx and made it pdf
</commit_message>
<xml_diff>
--- a/Resume.docx
+++ b/Resume.docx
@@ -349,6 +349,69 @@
     </w:p>
     <w:p>
       <w:pPr>
+        <w:rPr>
+          <w:rFonts w:ascii="Calibri" w:hAnsi="Calibri" w:cs="Calibri"/>
+          <w:color w:val="FFC000"/>
+          <w:sz w:val="36"/>
+          <w:szCs w:val="36"/>
+        </w:rPr>
+      </w:pPr>
+      <w:r>
+        <w:rPr>
+          <w:rFonts w:ascii="Calibri" w:hAnsi="Calibri" w:cs="Calibri"/>
+          <w:color w:val="FFC000"/>
+          <w:sz w:val="36"/>
+          <w:szCs w:val="36"/>
+        </w:rPr>
+        <w:t>CAREER OBJECTIVE</w:t>
+      </w:r>
+    </w:p>
+    <w:p>
+      <w:pPr>
+        <w:pStyle w:val="NormalWeb"/>
+        <w:shd w:val="clear" w:color="auto" w:fill="FFFFFF"/>
+        <w:spacing w:before="0" w:beforeAutospacing="0" w:after="0" w:afterAutospacing="0" w:line="276" w:lineRule="auto"/>
+        <w:textAlignment w:val="baseline"/>
+        <w:rPr>
+          <w:rFonts w:ascii="Helvetica" w:hAnsi="Helvetica"/>
+          <w:color w:val="000000"/>
+          <w:sz w:val="28"/>
+          <w:szCs w:val="28"/>
+        </w:rPr>
+      </w:pPr>
+    </w:p>
+    <w:p>
+      <w:pPr>
+        <w:pStyle w:val="NormalWeb"/>
+        <w:shd w:val="clear" w:color="auto" w:fill="FFFFFF"/>
+        <w:spacing w:before="0" w:beforeAutospacing="0" w:after="0" w:afterAutospacing="0" w:line="276" w:lineRule="auto"/>
+        <w:textAlignment w:val="baseline"/>
+        <w:rPr>
+          <w:rFonts w:ascii="Calibri" w:hAnsi="Calibri" w:cs="Calibri"/>
+          <w:color w:val="000000"/>
+          <w:sz w:val="28"/>
+          <w:szCs w:val="28"/>
+        </w:rPr>
+      </w:pPr>
+      <w:r>
+        <w:rPr>
+          <w:rFonts w:ascii="Calibri" w:hAnsi="Calibri" w:cs="Calibri"/>
+          <w:color w:val="000000"/>
+          <w:sz w:val="28"/>
+          <w:szCs w:val="28"/>
+        </w:rPr>
+        <w:t>Efficient recent high school graduate (3.8 GPA) with 9 months of work experience and a proven knowledge of brand management, contract negotiation &amp; management, and customer needs assessment. Aiming to leverage my abilities to successfully fill a management role at your company. Frequently praised as proactive by my peers, I can be relied upon to help your company achieve its goals.</w:t>
+      </w:r>
+    </w:p>
+    <w:p>
+      <w:pPr>
+        <w:rPr>
+          <w:rFonts w:ascii="Calibri" w:hAnsi="Calibri" w:cs="Calibri"/>
+        </w:rPr>
+      </w:pPr>
+    </w:p>
+    <w:p>
+      <w:pPr>
         <w:pStyle w:val="Heading3"/>
         <w:rPr>
           <w:rFonts w:ascii="Calibri" w:hAnsi="Calibri" w:cs="Calibri"/>
@@ -523,15 +586,22 @@
         </w:rPr>
         <w:t xml:space="preserve">Managed financial transactions for the company &amp; the </w:t>
       </w:r>
-      <w:proofErr w:type="spellStart"/>
       <w:r>
         <w:rPr>
           <w:rFonts w:ascii="Calibri" w:hAnsi="Calibri" w:cs="Calibri"/>
           <w:color w:val="000000" w:themeColor="text1"/>
         </w:rPr>
-        <w:t>instituions</w:t>
-      </w:r>
-      <w:proofErr w:type="spellEnd"/>
+        <w:t>institutions</w:t>
+      </w:r>
+    </w:p>
+    <w:p>
+      <w:pPr>
+        <w:pStyle w:val="ListParagraph"/>
+        <w:rPr>
+          <w:rFonts w:ascii="Calibri" w:hAnsi="Calibri" w:cs="Calibri"/>
+          <w:color w:val="000000" w:themeColor="text1"/>
+        </w:rPr>
+      </w:pPr>
     </w:p>
     <w:p>
       <w:pPr>
@@ -674,6 +744,10 @@
     <w:p>
       <w:pPr>
         <w:pStyle w:val="Heading4"/>
+        <w:numPr>
+          <w:ilvl w:val="0"/>
+          <w:numId w:val="1"/>
+        </w:numPr>
         <w:rPr>
           <w:rFonts w:ascii="Calibri" w:hAnsi="Calibri" w:cs="Calibri"/>
         </w:rPr>
@@ -693,93 +767,263 @@
     </w:p>
     <w:p>
       <w:pPr>
+        <w:pStyle w:val="Heading4"/>
+        <w:numPr>
+          <w:ilvl w:val="0"/>
+          <w:numId w:val="1"/>
+        </w:numPr>
+        <w:rPr>
+          <w:rFonts w:ascii="Calibri" w:hAnsi="Calibri" w:cs="Calibri"/>
+        </w:rPr>
+      </w:pPr>
+      <w:r>
+        <w:rPr>
+          <w:rFonts w:ascii="Calibri" w:hAnsi="Calibri" w:cs="Calibri"/>
+        </w:rPr>
+        <w:t>Principal Euphonium of the Evergreen Valley High School Wind Ensemble</w:t>
+      </w:r>
+    </w:p>
+    <w:p>
+      <w:pPr>
+        <w:pStyle w:val="Heading4"/>
+        <w:numPr>
+          <w:ilvl w:val="0"/>
+          <w:numId w:val="1"/>
+        </w:numPr>
+        <w:rPr>
+          <w:rFonts w:ascii="Calibri" w:hAnsi="Calibri" w:cs="Calibri"/>
+        </w:rPr>
+      </w:pPr>
+      <w:r>
+        <w:rPr>
+          <w:rFonts w:ascii="Calibri" w:hAnsi="Calibri" w:cs="Calibri"/>
+        </w:rPr>
+        <w:t>3rd Chair Euphonium in the Santa Clara County Honor Band</w:t>
+      </w:r>
+    </w:p>
+    <w:p>
+      <w:pPr>
+        <w:pStyle w:val="Heading4"/>
+        <w:numPr>
+          <w:ilvl w:val="0"/>
+          <w:numId w:val="1"/>
+        </w:numPr>
+        <w:rPr>
+          <w:rFonts w:ascii="Calibri" w:hAnsi="Calibri" w:cs="Calibri"/>
+        </w:rPr>
+      </w:pPr>
+      <w:r>
+        <w:rPr>
+          <w:rFonts w:ascii="Calibri" w:hAnsi="Calibri" w:cs="Calibri"/>
+        </w:rPr>
+        <w:t>Euphonium player at Evergreen Valley Youth Orchestra</w:t>
+      </w:r>
+    </w:p>
+    <w:p>
+      <w:pPr>
+        <w:pStyle w:val="Heading4"/>
+        <w:numPr>
+          <w:ilvl w:val="0"/>
+          <w:numId w:val="1"/>
+        </w:numPr>
+        <w:rPr>
+          <w:rFonts w:ascii="Calibri" w:hAnsi="Calibri" w:cs="Calibri"/>
+        </w:rPr>
+      </w:pPr>
+      <w:r>
+        <w:rPr>
+          <w:rFonts w:ascii="Calibri" w:hAnsi="Calibri" w:cs="Calibri"/>
+        </w:rPr>
+        <w:t>Teacher's Assistant at Most Holy Trinity Parish</w:t>
+      </w:r>
+    </w:p>
+    <w:p>
+      <w:pPr>
         <w:pStyle w:val="Heading5"/>
-        <w:rPr>
-          <w:rFonts w:ascii="Calibri" w:hAnsi="Calibri" w:cs="Calibri"/>
-        </w:rPr>
-      </w:pPr>
+      </w:pPr>
+    </w:p>
+    <w:p>
+      <w:pPr>
+        <w:pStyle w:val="Heading3"/>
+        <w:rPr>
+          <w:rFonts w:ascii="Calibri" w:hAnsi="Calibri" w:cs="Calibri"/>
+          <w:color w:val="FFC000"/>
+        </w:rPr>
+      </w:pPr>
+      <w:r>
+        <w:rPr>
+          <w:rFonts w:ascii="Calibri" w:hAnsi="Calibri" w:cs="Calibri"/>
+          <w:color w:val="FFC000"/>
+        </w:rPr>
+        <w:t>SKILLS</w:t>
+      </w:r>
+    </w:p>
+    <w:p>
+      <w:pPr>
+        <w:shd w:val="clear" w:color="auto" w:fill="F4F4F5"/>
+        <w:textAlignment w:val="baseline"/>
+        <w:rPr>
+          <w:rFonts w:ascii="Calibri" w:hAnsi="Calibri" w:cs="Calibri"/>
+          <w:color w:val="000000"/>
+          <w:sz w:val="28"/>
+          <w:szCs w:val="28"/>
+        </w:rPr>
+      </w:pPr>
+      <w:r>
+        <w:rPr>
+          <w:rFonts w:ascii="Calibri" w:hAnsi="Calibri" w:cs="Calibri"/>
+          <w:color w:val="000000"/>
+          <w:sz w:val="28"/>
+          <w:szCs w:val="28"/>
+        </w:rPr>
+        <w:t>Music</w:t>
+      </w:r>
+      <w:r>
+        <w:rPr>
+          <w:rFonts w:ascii="Calibri" w:hAnsi="Calibri" w:cs="Calibri"/>
+          <w:color w:val="000000"/>
+          <w:sz w:val="28"/>
+          <w:szCs w:val="28"/>
+        </w:rPr>
+        <w:t xml:space="preserve"> </w:t>
+      </w:r>
+      <w:r>
+        <w:rPr>
+          <w:rFonts w:ascii="Calibri" w:hAnsi="Calibri" w:cs="Calibri"/>
+          <w:color w:val="000000"/>
+          <w:sz w:val="28"/>
+          <w:szCs w:val="28"/>
+        </w:rPr>
+        <w:t>–</w:t>
+      </w:r>
+      <w:r>
+        <w:rPr>
+          <w:rFonts w:ascii="Calibri" w:hAnsi="Calibri" w:cs="Calibri"/>
+          <w:color w:val="000000"/>
+          <w:sz w:val="28"/>
+          <w:szCs w:val="28"/>
+        </w:rPr>
+        <w:t xml:space="preserve"> Played</w:t>
+      </w:r>
+      <w:r>
+        <w:rPr>
+          <w:rFonts w:ascii="Calibri" w:hAnsi="Calibri" w:cs="Calibri"/>
+          <w:color w:val="000000"/>
+          <w:sz w:val="28"/>
+          <w:szCs w:val="28"/>
+        </w:rPr>
+        <w:t xml:space="preserve"> the Euphoniums</w:t>
+      </w:r>
       <w:bookmarkStart w:id="0" w:name="_GoBack"/>
       <w:bookmarkEnd w:id="0"/>
-    </w:p>
-    <w:p>
-      <w:pPr>
-        <w:pStyle w:val="Heading4"/>
-        <w:rPr>
-          <w:rFonts w:ascii="Calibri" w:hAnsi="Calibri" w:cs="Calibri"/>
-        </w:rPr>
-      </w:pPr>
-      <w:r>
-        <w:rPr>
-          <w:rFonts w:ascii="Calibri" w:hAnsi="Calibri" w:cs="Calibri"/>
-        </w:rPr>
-        <w:t>Principal Euphonium of the Evergreen Valley High School Wind Ensemble</w:t>
-      </w:r>
-    </w:p>
-    <w:p>
-      <w:pPr>
-        <w:pStyle w:val="Heading5"/>
-        <w:rPr>
-          <w:rFonts w:ascii="Calibri" w:hAnsi="Calibri" w:cs="Calibri"/>
-        </w:rPr>
-      </w:pPr>
-    </w:p>
-    <w:p>
-      <w:pPr>
-        <w:pStyle w:val="Heading4"/>
-        <w:rPr>
-          <w:rFonts w:ascii="Calibri" w:hAnsi="Calibri" w:cs="Calibri"/>
-        </w:rPr>
-      </w:pPr>
-      <w:r>
-        <w:rPr>
-          <w:rFonts w:ascii="Calibri" w:hAnsi="Calibri" w:cs="Calibri"/>
-        </w:rPr>
-        <w:t>3rd Chair Euphonium in the Santa Clara County Honor Band</w:t>
-      </w:r>
-    </w:p>
-    <w:p>
-      <w:pPr>
-        <w:pStyle w:val="Heading5"/>
-        <w:rPr>
-          <w:rFonts w:ascii="Calibri" w:hAnsi="Calibri" w:cs="Calibri"/>
-        </w:rPr>
-      </w:pPr>
-    </w:p>
-    <w:p>
-      <w:pPr>
-        <w:pStyle w:val="Heading4"/>
-        <w:rPr>
-          <w:rFonts w:ascii="Calibri" w:hAnsi="Calibri" w:cs="Calibri"/>
-        </w:rPr>
-      </w:pPr>
-      <w:r>
-        <w:rPr>
-          <w:rFonts w:ascii="Calibri" w:hAnsi="Calibri" w:cs="Calibri"/>
-        </w:rPr>
-        <w:t>Euphonium player at Evergreen Valley Youth Orchestra</w:t>
-      </w:r>
-    </w:p>
-    <w:p>
-      <w:pPr>
-        <w:pStyle w:val="Heading5"/>
-        <w:rPr>
-          <w:rFonts w:ascii="Calibri" w:hAnsi="Calibri" w:cs="Calibri"/>
-        </w:rPr>
-      </w:pPr>
-    </w:p>
-    <w:p>
-      <w:pPr>
-        <w:pStyle w:val="Heading4"/>
-        <w:rPr>
-          <w:rFonts w:ascii="Calibri" w:hAnsi="Calibri" w:cs="Calibri"/>
-        </w:rPr>
-      </w:pPr>
-      <w:r>
-        <w:rPr>
-          <w:rFonts w:ascii="Calibri" w:hAnsi="Calibri" w:cs="Calibri"/>
-        </w:rPr>
-        <w:t>Teacher's Assistant at Most Holy Trinity Parish</w:t>
-      </w:r>
+      <w:r>
+        <w:rPr>
+          <w:rFonts w:ascii="Calibri" w:hAnsi="Calibri" w:cs="Calibri"/>
+          <w:color w:val="000000"/>
+          <w:sz w:val="28"/>
+          <w:szCs w:val="28"/>
+        </w:rPr>
+        <w:t xml:space="preserve"> in my high school's band as well as outside ensembles</w:t>
+      </w:r>
+    </w:p>
+    <w:p>
+      <w:pPr>
+        <w:shd w:val="clear" w:color="auto" w:fill="F4F4F5"/>
+        <w:textAlignment w:val="baseline"/>
+        <w:rPr>
+          <w:rFonts w:ascii="Calibri" w:hAnsi="Calibri" w:cs="Calibri"/>
+          <w:color w:val="000000"/>
+          <w:sz w:val="28"/>
+          <w:szCs w:val="28"/>
+        </w:rPr>
+      </w:pPr>
+      <w:r>
+        <w:rPr>
+          <w:rFonts w:ascii="Calibri" w:hAnsi="Calibri" w:cs="Calibri"/>
+          <w:color w:val="000000"/>
+          <w:sz w:val="28"/>
+          <w:szCs w:val="28"/>
+        </w:rPr>
+        <w:t xml:space="preserve">Programming - Experience with HTML, CSS, </w:t>
+      </w:r>
+      <w:proofErr w:type="spellStart"/>
+      <w:r>
+        <w:rPr>
+          <w:rFonts w:ascii="Calibri" w:hAnsi="Calibri" w:cs="Calibri"/>
+          <w:color w:val="000000"/>
+          <w:sz w:val="28"/>
+          <w:szCs w:val="28"/>
+        </w:rPr>
+        <w:t>Javascript</w:t>
+      </w:r>
+      <w:proofErr w:type="spellEnd"/>
+      <w:r>
+        <w:rPr>
+          <w:rFonts w:ascii="Calibri" w:hAnsi="Calibri" w:cs="Calibri"/>
+          <w:color w:val="000000"/>
+          <w:sz w:val="28"/>
+          <w:szCs w:val="28"/>
+        </w:rPr>
+        <w:t>, and Java</w:t>
+      </w:r>
+    </w:p>
+    <w:p>
+      <w:pPr>
+        <w:shd w:val="clear" w:color="auto" w:fill="F4F4F5"/>
+        <w:textAlignment w:val="baseline"/>
+        <w:rPr>
+          <w:rFonts w:ascii="Calibri" w:hAnsi="Calibri" w:cs="Calibri"/>
+          <w:color w:val="000000"/>
+          <w:sz w:val="28"/>
+          <w:szCs w:val="28"/>
+        </w:rPr>
+      </w:pPr>
+      <w:r>
+        <w:rPr>
+          <w:rFonts w:ascii="Calibri" w:hAnsi="Calibri" w:cs="Calibri"/>
+          <w:color w:val="000000"/>
+          <w:sz w:val="28"/>
+          <w:szCs w:val="28"/>
+        </w:rPr>
+        <w:t>Video Editing - Experience with video editing programs such as iMovie, Final Cut Pro, &amp; Adobe Premiere CC.</w:t>
+      </w:r>
+    </w:p>
+    <w:p>
+      <w:pPr>
+        <w:shd w:val="clear" w:color="auto" w:fill="F4F4F5"/>
+        <w:textAlignment w:val="baseline"/>
+        <w:rPr>
+          <w:rFonts w:ascii="Calibri" w:hAnsi="Calibri" w:cs="Calibri"/>
+          <w:color w:val="000000"/>
+          <w:sz w:val="28"/>
+          <w:szCs w:val="28"/>
+        </w:rPr>
+      </w:pPr>
+      <w:r>
+        <w:rPr>
+          <w:rFonts w:ascii="Calibri" w:hAnsi="Calibri" w:cs="Calibri"/>
+          <w:color w:val="000000"/>
+          <w:sz w:val="28"/>
+          <w:szCs w:val="28"/>
+        </w:rPr>
+        <w:t>Computers - Experience with circui</w:t>
+      </w:r>
+      <w:r>
+        <w:rPr>
+          <w:rFonts w:ascii="Calibri" w:hAnsi="Calibri" w:cs="Calibri"/>
+          <w:color w:val="000000"/>
+          <w:sz w:val="28"/>
+          <w:szCs w:val="28"/>
+        </w:rPr>
+        <w:t>t board design and assembly</w:t>
+      </w:r>
+    </w:p>
+    <w:p>
+      <w:pPr>
+        <w:rPr>
+          <w:lang w:eastAsia="ja-JP"/>
+        </w:rPr>
+      </w:pPr>
     </w:p>
     <w:p>
       <w:pPr>
@@ -1530,6 +1774,155 @@
 <file path=word/numbering.xml><?xml version="1.0" encoding="utf-8"?>
 <w:numbering xmlns:wpc="http://schemas.microsoft.com/office/word/2010/wordprocessingCanvas" xmlns:cx="http://schemas.microsoft.com/office/drawing/2014/chartex" xmlns:cx1="http://schemas.microsoft.com/office/drawing/2015/9/8/chartex" xmlns:cx2="http://schemas.microsoft.com/office/drawing/2015/10/21/chartex" xmlns:cx3="http://schemas.microsoft.com/office/drawing/2016/5/9/chartex" xmlns:cx4="http://schemas.microsoft.com/office/drawing/2016/5/10/chartex" xmlns:cx5="http://schemas.microsoft.com/office/drawing/2016/5/11/chartex" xmlns:cx6="http://schemas.microsoft.com/office/drawing/2016/5/12/chartex" xmlns:cx7="http://schemas.microsoft.com/office/drawing/2016/5/13/chartex" xmlns:cx8="http://schemas.microsoft.com/office/drawing/2016/5/14/chartex" xmlns:mc="http://schemas.openxmlformats.org/markup-compatibility/2006" xmlns:aink="http://schemas.microsoft.com/office/drawing/2016/ink" xmlns:am3d="http://schemas.microsoft.com/office/drawing/2017/model3d" xmlns:o="urn:schemas-microsoft-com:office:office" xmlns:r="http://schemas.openxmlformats.org/officeDocument/2006/relationships" xmlns:m="http://schemas.openxmlformats.org/officeDocument/2006/math" xmlns:v="urn:schemas-microsoft-com:vml" xmlns:wp14="http://schemas.microsoft.com/office/word/2010/wordprocessingDrawing" xmlns:wp="http://schemas.openxmlformats.org/drawingml/2006/wordprocessingDrawing" xmlns:w10="urn:schemas-microsoft-com:office:word" xmlns:w="http://schemas.openxmlformats.org/wordprocessingml/2006/main" xmlns:w14="http://schemas.microsoft.com/office/word/2010/wordml" xmlns:w15="http://schemas.microsoft.com/office/word/2012/wordml" xmlns:w16cid="http://schemas.microsoft.com/office/word/2016/wordml/cid" xmlns:w16se="http://schemas.microsoft.com/office/word/2015/wordml/symex" xmlns:wpg="http://schemas.microsoft.com/office/word/2010/wordprocessingGroup" xmlns:wpi="http://schemas.microsoft.com/office/word/2010/wordprocessingInk" xmlns:wne="http://schemas.microsoft.com/office/word/2006/wordml" xmlns:wps="http://schemas.microsoft.com/office/word/2010/wordprocessingShape" mc:Ignorable="w14 w15 w16se w16cid wp14">
   <w:abstractNum w:abstractNumId="0" w15:restartNumberingAfterBreak="0">
+    <w:nsid w:val="2AC055CD"/>
+    <w:multiLevelType w:val="multilevel"/>
+    <w:tmpl w:val="B066AB98"/>
+    <w:lvl w:ilvl="0">
+      <w:start w:val="1"/>
+      <w:numFmt w:val="bullet"/>
+      <w:lvlText w:val=""/>
+      <w:lvlJc w:val="left"/>
+      <w:pPr>
+        <w:tabs>
+          <w:tab w:val="num" w:pos="720"/>
+        </w:tabs>
+        <w:ind w:left="720" w:hanging="360"/>
+      </w:pPr>
+      <w:rPr>
+        <w:rFonts w:ascii="Symbol" w:hAnsi="Symbol" w:hint="default"/>
+        <w:sz w:val="20"/>
+      </w:rPr>
+    </w:lvl>
+    <w:lvl w:ilvl="1" w:tentative="1">
+      <w:start w:val="1"/>
+      <w:numFmt w:val="bullet"/>
+      <w:lvlText w:val="o"/>
+      <w:lvlJc w:val="left"/>
+      <w:pPr>
+        <w:tabs>
+          <w:tab w:val="num" w:pos="1440"/>
+        </w:tabs>
+        <w:ind w:left="1440" w:hanging="360"/>
+      </w:pPr>
+      <w:rPr>
+        <w:rFonts w:ascii="Courier New" w:hAnsi="Courier New" w:hint="default"/>
+        <w:sz w:val="20"/>
+      </w:rPr>
+    </w:lvl>
+    <w:lvl w:ilvl="2" w:tentative="1">
+      <w:start w:val="1"/>
+      <w:numFmt w:val="bullet"/>
+      <w:lvlText w:val=""/>
+      <w:lvlJc w:val="left"/>
+      <w:pPr>
+        <w:tabs>
+          <w:tab w:val="num" w:pos="2160"/>
+        </w:tabs>
+        <w:ind w:left="2160" w:hanging="360"/>
+      </w:pPr>
+      <w:rPr>
+        <w:rFonts w:ascii="Wingdings" w:hAnsi="Wingdings" w:hint="default"/>
+        <w:sz w:val="20"/>
+      </w:rPr>
+    </w:lvl>
+    <w:lvl w:ilvl="3" w:tentative="1">
+      <w:start w:val="1"/>
+      <w:numFmt w:val="bullet"/>
+      <w:lvlText w:val=""/>
+      <w:lvlJc w:val="left"/>
+      <w:pPr>
+        <w:tabs>
+          <w:tab w:val="num" w:pos="2880"/>
+        </w:tabs>
+        <w:ind w:left="2880" w:hanging="360"/>
+      </w:pPr>
+      <w:rPr>
+        <w:rFonts w:ascii="Wingdings" w:hAnsi="Wingdings" w:hint="default"/>
+        <w:sz w:val="20"/>
+      </w:rPr>
+    </w:lvl>
+    <w:lvl w:ilvl="4" w:tentative="1">
+      <w:start w:val="1"/>
+      <w:numFmt w:val="bullet"/>
+      <w:lvlText w:val=""/>
+      <w:lvlJc w:val="left"/>
+      <w:pPr>
+        <w:tabs>
+          <w:tab w:val="num" w:pos="3600"/>
+        </w:tabs>
+        <w:ind w:left="3600" w:hanging="360"/>
+      </w:pPr>
+      <w:rPr>
+        <w:rFonts w:ascii="Wingdings" w:hAnsi="Wingdings" w:hint="default"/>
+        <w:sz w:val="20"/>
+      </w:rPr>
+    </w:lvl>
+    <w:lvl w:ilvl="5" w:tentative="1">
+      <w:start w:val="1"/>
+      <w:numFmt w:val="bullet"/>
+      <w:lvlText w:val=""/>
+      <w:lvlJc w:val="left"/>
+      <w:pPr>
+        <w:tabs>
+          <w:tab w:val="num" w:pos="4320"/>
+        </w:tabs>
+        <w:ind w:left="4320" w:hanging="360"/>
+      </w:pPr>
+      <w:rPr>
+        <w:rFonts w:ascii="Wingdings" w:hAnsi="Wingdings" w:hint="default"/>
+        <w:sz w:val="20"/>
+      </w:rPr>
+    </w:lvl>
+    <w:lvl w:ilvl="6" w:tentative="1">
+      <w:start w:val="1"/>
+      <w:numFmt w:val="bullet"/>
+      <w:lvlText w:val=""/>
+      <w:lvlJc w:val="left"/>
+      <w:pPr>
+        <w:tabs>
+          <w:tab w:val="num" w:pos="5040"/>
+        </w:tabs>
+        <w:ind w:left="5040" w:hanging="360"/>
+      </w:pPr>
+      <w:rPr>
+        <w:rFonts w:ascii="Wingdings" w:hAnsi="Wingdings" w:hint="default"/>
+        <w:sz w:val="20"/>
+      </w:rPr>
+    </w:lvl>
+    <w:lvl w:ilvl="7" w:tentative="1">
+      <w:start w:val="1"/>
+      <w:numFmt w:val="bullet"/>
+      <w:lvlText w:val=""/>
+      <w:lvlJc w:val="left"/>
+      <w:pPr>
+        <w:tabs>
+          <w:tab w:val="num" w:pos="5760"/>
+        </w:tabs>
+        <w:ind w:left="5760" w:hanging="360"/>
+      </w:pPr>
+      <w:rPr>
+        <w:rFonts w:ascii="Wingdings" w:hAnsi="Wingdings" w:hint="default"/>
+        <w:sz w:val="20"/>
+      </w:rPr>
+    </w:lvl>
+    <w:lvl w:ilvl="8" w:tentative="1">
+      <w:start w:val="1"/>
+      <w:numFmt w:val="bullet"/>
+      <w:lvlText w:val=""/>
+      <w:lvlJc w:val="left"/>
+      <w:pPr>
+        <w:tabs>
+          <w:tab w:val="num" w:pos="6480"/>
+        </w:tabs>
+        <w:ind w:left="6480" w:hanging="360"/>
+      </w:pPr>
+      <w:rPr>
+        <w:rFonts w:ascii="Wingdings" w:hAnsi="Wingdings" w:hint="default"/>
+        <w:sz w:val="20"/>
+      </w:rPr>
+    </w:lvl>
+  </w:abstractNum>
+  <w:abstractNum w:abstractNumId="1" w15:restartNumberingAfterBreak="0">
     <w:nsid w:val="4CF33B5C"/>
     <w:multiLevelType w:val="hybridMultilevel"/>
     <w:tmpl w:val="57608A80"/>
@@ -1642,6 +2035,9 @@
     </w:lvl>
   </w:abstractNum>
   <w:num w:numId="1">
+    <w:abstractNumId w:val="1"/>
+  </w:num>
+  <w:num w:numId="2">
     <w:abstractNumId w:val="0"/>
   </w:num>
 </w:numbering>
@@ -2042,7 +2438,7 @@
   <w:style w:type="paragraph" w:default="1" w:styleId="Normal">
     <w:name w:val="Normal"/>
     <w:qFormat/>
-    <w:rsid w:val="00CD2AB4"/>
+    <w:rsid w:val="0085043F"/>
     <w:pPr>
       <w:spacing w:after="0" w:line="240" w:lineRule="auto"/>
     </w:pPr>
@@ -2514,6 +2910,17 @@
       <w:contextualSpacing/>
     </w:pPr>
   </w:style>
+  <w:style w:type="paragraph" w:styleId="NormalWeb">
+    <w:name w:val="Normal (Web)"/>
+    <w:basedOn w:val="Normal"/>
+    <w:uiPriority w:val="99"/>
+    <w:semiHidden/>
+    <w:unhideWhenUsed/>
+    <w:rsid w:val="0085043F"/>
+    <w:pPr>
+      <w:spacing w:before="100" w:beforeAutospacing="1" w:after="100" w:afterAutospacing="1"/>
+    </w:pPr>
+  </w:style>
 </w:styles>
 </file>
 

</xml_diff>